<commit_message>
aggiornamento 2026 04 28 16:06
</commit_message>
<xml_diff>
--- a/AntonioCristiano/Fust1_CV_10_Mandich_RIccardo.docx
+++ b/AntonioCristiano/Fust1_CV_10_Mandich_RIccardo.docx
@@ -755,9 +755,64 @@
           <w:sz w:val="26"/>
           <w:szCs w:val="26"/>
         </w:rPr>
-        <w:t xml:space="preserve">ESPERIENZE PROFESSIONALI </w:t>
-      </w:r>
-      <w:r>
+        <w:t>ESPERIENZE PROFESSIONALI</w:t>
+      </w:r>
+    </w:p>
+    <w:p>
+      <w:pPr>
+        <w:spacing w:before="160" w:after="80" w:line="240" w:lineRule="auto"/>
+        <w:ind w:left="-566" w:right="-607"/>
+        <w:rPr>
+          <w:b/>
+          <w:bCs/>
+        </w:rPr>
+      </w:pPr>
+      <w:r>
+        <w:rPr>
+          <w:b/>
+          <w:bCs/>
+        </w:rPr>
+        <w:lastRenderedPageBreak/>
+        <w:t>SIPE Scorzè – PCTO formativo</w:t>
+      </w:r>
+      <w:r>
+        <w:rPr>
+          <w:b/>
+          <w:bCs/>
+        </w:rPr>
+        <w:t xml:space="preserve"> scuola superiore</w:t>
+      </w:r>
+      <w:r>
+        <w:rPr>
+          <w:b/>
+          <w:bCs/>
+        </w:rPr>
+        <w:t xml:space="preserve"> (</w:t>
+      </w:r>
+      <w:r>
+        <w:rPr>
+          <w:b/>
+          <w:bCs/>
+        </w:rPr>
+        <w:t>09/2025 – 10/2025)</w:t>
+      </w:r>
+    </w:p>
+    <w:p>
+      <w:pPr>
+        <w:spacing w:before="160" w:after="80" w:line="240" w:lineRule="auto"/>
+        <w:ind w:left="-566" w:right="-607"/>
+      </w:pPr>
+      <w:r>
+        <w:t xml:space="preserve"> Formazione nella creazione di una web app a partire dalle basi con Springboot, ORM e Maven (accenni a angular senza nessun utilizzo pratico)</w:t>
+      </w:r>
+    </w:p>
+    <w:p>
+      <w:pPr>
+        <w:pStyle w:val="Heading3"/>
+        <w:keepNext w:val="0"/>
+        <w:keepLines w:val="0"/>
+        <w:spacing w:before="160" w:line="240" w:lineRule="auto"/>
+        <w:ind w:left="-566" w:right="-607"/>
         <w:rPr>
           <w:b/>
           <w:bCs/>
@@ -767,55 +822,47 @@
           <w:sz w:val="26"/>
           <w:szCs w:val="26"/>
         </w:rPr>
-        <w:t>(se presenti)</w:t>
-      </w:r>
-    </w:p>
-    <w:p>
-      <w:pPr>
-        <w:spacing w:before="160" w:after="80" w:line="240" w:lineRule="auto"/>
-        <w:ind w:left="-566" w:right="-607"/>
-        <w:rPr>
-          <w:b/>
-          <w:bCs/>
-        </w:rPr>
-      </w:pPr>
-      <w:r>
-        <w:rPr>
-          <w:b/>
-          <w:bCs/>
-        </w:rPr>
-        <w:lastRenderedPageBreak/>
-        <w:t>SIPE Scorzè – PCTO formativo</w:t>
-      </w:r>
-      <w:r>
-        <w:rPr>
-          <w:b/>
-          <w:bCs/>
-        </w:rPr>
-        <w:t xml:space="preserve"> scuola superiore</w:t>
-      </w:r>
-      <w:r>
-        <w:rPr>
-          <w:b/>
-          <w:bCs/>
-        </w:rPr>
-        <w:t xml:space="preserve"> (</w:t>
-      </w:r>
-      <w:r>
-        <w:rPr>
-          <w:b/>
-          <w:bCs/>
-        </w:rPr>
-        <w:t>09/2025 – 10/2025)</w:t>
-      </w:r>
-    </w:p>
-    <w:p>
-      <w:pPr>
-        <w:spacing w:before="160" w:after="80" w:line="240" w:lineRule="auto"/>
-        <w:ind w:left="-566" w:right="-607"/>
-      </w:pPr>
-      <w:r>
-        <w:t xml:space="preserve"> Formazione nella creazione di una web app a partire dalle basi con Springboot, ORM e Maven (accenni a angular senza nessun utilizzo pratico)</w:t>
+      </w:pPr>
+      <w:r>
+        <w:rPr>
+          <w:b/>
+          <w:bCs/>
+          <w:i/>
+          <w:iCs/>
+          <w:color w:val="000000"/>
+          <w:sz w:val="26"/>
+          <w:szCs w:val="26"/>
+        </w:rPr>
+        <w:t>ATTIVITÀ EXTRACURRICOLARI</w:t>
+      </w:r>
+    </w:p>
+    <w:p>
+      <w:pPr>
+        <w:spacing w:before="160" w:after="80" w:line="240" w:lineRule="auto"/>
+        <w:ind w:left="-566" w:right="-607"/>
+        <w:rPr>
+          <w:b/>
+          <w:bCs/>
+        </w:rPr>
+      </w:pPr>
+      <w:r>
+        <w:rPr>
+          <w:b/>
+          <w:bCs/>
+        </w:rPr>
+        <w:t>ITS Cybergames</w:t>
+      </w:r>
+    </w:p>
+    <w:p>
+      <w:pPr>
+        <w:spacing w:before="160" w:after="80" w:line="240" w:lineRule="auto"/>
+        <w:ind w:left="-566" w:right="-607"/>
+      </w:pPr>
+      <w:r>
+        <w:t>Partecipazione agli ITS Cybergames 2026 Competizione a squadre arriva</w:t>
+      </w:r>
+      <w:r>
+        <w:t>ndo al 3° posto</w:t>
       </w:r>
     </w:p>
     <w:p>

</xml_diff>

<commit_message>
aggiornamento 2026 09 22 12:43
</commit_message>
<xml_diff>
--- a/AntonioCristiano/Fust1_CV_10_Mandich_RIccardo.docx
+++ b/AntonioCristiano/Fust1_CV_10_Mandich_RIccardo.docx
@@ -773,28 +773,7 @@
           <w:bCs/>
         </w:rPr>
         <w:lastRenderedPageBreak/>
-        <w:t>SIPE Scorzè – PCTO formativo</w:t>
-      </w:r>
-      <w:r>
-        <w:rPr>
-          <w:b/>
-          <w:bCs/>
-        </w:rPr>
-        <w:t xml:space="preserve"> scuola superiore</w:t>
-      </w:r>
-      <w:r>
-        <w:rPr>
-          <w:b/>
-          <w:bCs/>
-        </w:rPr>
-        <w:t xml:space="preserve"> (</w:t>
-      </w:r>
-      <w:r>
-        <w:rPr>
-          <w:b/>
-          <w:bCs/>
-        </w:rPr>
-        <w:t>09/2025 – 10/2025)</w:t>
+        <w:t>SIPE Scorzè – PCTO formativo scuola superiore (09/2025 – 10/2025)</w:t>
       </w:r>
     </w:p>
     <w:p>
@@ -804,6 +783,112 @@
       </w:pPr>
       <w:r>
         <w:t xml:space="preserve"> Formazione nella creazione di una web app a partire dalle basi con Springboot, ORM e Maven (accenni a angular senza nessun utilizzo pratico)</w:t>
+      </w:r>
+    </w:p>
+    <w:p>
+      <w:pPr>
+        <w:spacing w:before="160" w:after="80" w:line="240" w:lineRule="auto"/>
+        <w:ind w:left="-566" w:right="-607"/>
+        <w:rPr>
+          <w:b/>
+          <w:bCs/>
+        </w:rPr>
+      </w:pPr>
+      <w:r>
+        <w:rPr>
+          <w:b/>
+          <w:bCs/>
+        </w:rPr>
+        <w:t xml:space="preserve">Danieli Buttrio </w:t>
+      </w:r>
+      <w:r>
+        <w:rPr>
+          <w:b/>
+          <w:bCs/>
+        </w:rPr>
+        <w:t xml:space="preserve">– </w:t>
+      </w:r>
+      <w:r>
+        <w:rPr>
+          <w:b/>
+          <w:bCs/>
+        </w:rPr>
+        <w:t xml:space="preserve">stage formativo primo anno di ITS Alto Adriatico </w:t>
+      </w:r>
+      <w:r>
+        <w:rPr>
+          <w:b/>
+          <w:bCs/>
+        </w:rPr>
+        <w:t>(</w:t>
+      </w:r>
+      <w:r>
+        <w:rPr>
+          <w:b/>
+          <w:bCs/>
+        </w:rPr>
+        <w:t>05</w:t>
+      </w:r>
+      <w:r>
+        <w:rPr>
+          <w:b/>
+          <w:bCs/>
+        </w:rPr>
+        <w:t>/202</w:t>
+      </w:r>
+      <w:r>
+        <w:rPr>
+          <w:b/>
+          <w:bCs/>
+        </w:rPr>
+        <w:t>6</w:t>
+      </w:r>
+      <w:r>
+        <w:rPr>
+          <w:b/>
+          <w:bCs/>
+        </w:rPr>
+        <w:t xml:space="preserve"> – </w:t>
+      </w:r>
+      <w:r>
+        <w:rPr>
+          <w:b/>
+          <w:bCs/>
+        </w:rPr>
+        <w:t>07</w:t>
+      </w:r>
+      <w:r>
+        <w:rPr>
+          <w:b/>
+          <w:bCs/>
+        </w:rPr>
+        <w:t>/202</w:t>
+      </w:r>
+      <w:r>
+        <w:rPr>
+          <w:b/>
+          <w:bCs/>
+        </w:rPr>
+        <w:t>6</w:t>
+      </w:r>
+      <w:r>
+        <w:rPr>
+          <w:b/>
+          <w:bCs/>
+        </w:rPr>
+        <w:t>)</w:t>
+      </w:r>
+    </w:p>
+    <w:p>
+      <w:pPr>
+        <w:spacing w:before="160" w:after="80" w:line="240" w:lineRule="auto"/>
+        <w:ind w:left="-566" w:right="-607"/>
+      </w:pPr>
+      <w:r>
+        <w:t xml:space="preserve"> Formazione nella creazione di un</w:t>
+      </w:r>
+      <w:r>
+        <w:t xml:space="preserve"> microservizio ad uso interno per automatizzare l’ingestion di una o più wiki code di DevOps con salvataggio del contenuto su blob storage, dei metadati su CosmoDB e l’invio di un evento di fine su un azure event hub</w:t>
       </w:r>
     </w:p>
     <w:p>

</xml_diff>